<commit_message>
Add AI visual projects and refresh portfolio publications
</commit_message>
<xml_diff>
--- a/deliverables/resume/sun-yingjie-resume-digital-en.docx
+++ b/deliverables/resume/sun-yingjie-resume-digital-en.docx
@@ -139,7 +139,7 @@
           <w:color w:val="20221F"/>
           <w:sz w:val="22"/>
         </w:rPr>
-        <w:t>I turn complex tasks into clear inputs, actions and feedback through interface design, prototypes and open-source integration.</w:t>
+        <w:t>I combine interface design with AI visual creation, translating character, lighting and camera requirements into reviewable images and films.</w:t>
       </w:r>
     </w:p>
     <w:p>
@@ -236,14 +236,14 @@
           <w:color w:val="20221F"/>
           <w:sz w:val="22"/>
         </w:rPr>
-        <w:t xml:space="preserve">Creative systems: </w:t>
+        <w:t xml:space="preserve">AI imagery and film: </w:t>
       </w:r>
       <w:r>
         <w:rPr>
           <w:color w:val="20221F"/>
           <w:sz w:val="22"/>
         </w:rPr>
-        <w:t>Organise AI-video inputs, camera direction and review through storyboards and blocking.</w:t>
+        <w:t>Create ink film, character sheets and lighting studies; structure prompts and review output.</w:t>
       </w:r>
     </w:p>
     <w:p>
@@ -559,14 +559,14 @@
           <w:color w:val="20221F"/>
           <w:sz w:val="22"/>
         </w:rPr>
-        <w:t xml:space="preserve">AI and research: </w:t>
+        <w:t xml:space="preserve">AI creation: </w:t>
       </w:r>
       <w:r>
         <w:rPr>
           <w:color w:val="20221F"/>
           <w:sz w:val="22"/>
         </w:rPr>
-        <w:t>Codex, ChatGPT, ComfyUI, Midjourney; market and cultural context</w:t>
+        <w:t>Codex, Image 2.5, Seedance 2.5, ComfyUI</w:t>
       </w:r>
     </w:p>
     <w:p>
@@ -581,7 +581,7 @@
           <w:color w:val="20221F"/>
           <w:sz w:val="22"/>
         </w:rPr>
-        <w:t>Independent AI-video research: a reference index, six control layers and eight analyses linked to storyboard, Blender blocking and render review. Human-led judgment; the practice focuses on workflow method and application.</w:t>
+        <w:t>Personal AI practice: a 30-second ink film, five character-sheet images and nine lighting images. Direction, prompt organisation and output review.</w:t>
       </w:r>
     </w:p>
     <w:p>

</xml_diff>